<commit_message>
feat: atualizar documentação e checklist para NFC-e
</commit_message>
<xml_diff>
--- a/docs/SystemPro_NFCe_Documentacao_e_Checklist_Homologacao.docx
+++ b/docs/SystemPro_NFCe_Documentacao_e_Checklist_Homologacao.docx
@@ -1699,11 +1699,7 @@
         <w:spacing w:after="60"/>
       </w:pPr>
       <w:r>
-        <w:rPr>
-          <w:rFonts w:ascii="Aptos" w:hAnsi="Aptos"/>
-          <w:sz w:val="21"/>
-        </w:rPr>
-        <w:t>Credenciamento para emissão de NFC-e em Minas Gerais e obtenção do CSC/ID do CSC, conforme o ambiente.</w:t>
+        <w:t>• Credenciamento para emissão de NFC-e em Minas Gerais e configuração do ambiente fiscal aplicável.</w:t>
       </w:r>
     </w:p>
     <w:p>
@@ -1829,20 +1825,7 @@
         <w:spacing w:after="40"/>
       </w:pPr>
       <w:r>
-        <w:rPr>
-          <w:rFonts w:ascii="Aptos" w:hAnsi="Aptos"/>
-          <w:b/>
-          <w:color w:val="1F4E79"/>
-          <w:sz w:val="21"/>
-        </w:rPr>
-        <w:t xml:space="preserve">2. Configurar o estabelecimento fiscal - </w:t>
-      </w:r>
-      <w:r>
-        <w:rPr>
-          <w:rFonts w:ascii="Aptos" w:hAnsi="Aptos"/>
-          <w:sz w:val="21"/>
-        </w:rPr>
-        <w:t>Selecionar empresa, ambiente HOMOLOGAÇÃO, regime tributário, série/numeração, CSC/ID CSC e certificado.</w:t>
+        <w:t>2. Configurar o estabelecimento fiscal - Selecionar empresa, ambiente HOMOLOGAÇÃO, regime tributário, série/numeração e certificado. CSC/ID CSC não é requisito do QR Code v3 online.</w:t>
       </w:r>
     </w:p>
     <w:p>
@@ -2761,14 +2744,7 @@
             <w:vAlign w:val="center"/>
           </w:tcPr>
           <w:p>
-            <w:pPr>
-              <w:spacing w:after="0"/>
-            </w:pPr>
             <w:r>
-              <w:rPr>
-                <w:rFonts w:ascii="Aptos" w:hAnsi="Aptos"/>
-                <w:sz w:val="18"/>
-              </w:rPr>
               <w:t>PENDENTE</w:t>
             </w:r>
           </w:p>
@@ -2786,15 +2762,8 @@
             <w:vAlign w:val="center"/>
           </w:tcPr>
           <w:p>
-            <w:pPr>
-              <w:spacing w:after="0"/>
-            </w:pPr>
             <w:r>
-              <w:rPr>
-                <w:rFonts w:ascii="Aptos" w:hAnsi="Aptos"/>
-                <w:sz w:val="18"/>
-              </w:rPr>
-              <w:t>Preencher com dados reais de homologação.</w:t>
+              <w:t>Depende de dados reais do ambiente de homologação.</w:t>
             </w:r>
           </w:p>
         </w:tc>
@@ -2860,14 +2829,7 @@
             <w:vAlign w:val="center"/>
           </w:tcPr>
           <w:p>
-            <w:pPr>
-              <w:spacing w:after="0"/>
-            </w:pPr>
             <w:r>
-              <w:rPr>
-                <w:rFonts w:ascii="Aptos" w:hAnsi="Aptos"/>
-                <w:sz w:val="18"/>
-              </w:rPr>
               <w:t>PENDENTE</w:t>
             </w:r>
           </w:p>
@@ -2884,15 +2846,8 @@
             <w:vAlign w:val="center"/>
           </w:tcPr>
           <w:p>
-            <w:pPr>
-              <w:spacing w:after="0"/>
-            </w:pPr>
             <w:r>
-              <w:rPr>
-                <w:rFonts w:ascii="Aptos" w:hAnsi="Aptos"/>
-                <w:sz w:val="18"/>
-              </w:rPr>
-              <w:t>Testar leitura, senha e comunicação TLS real.</w:t>
+              <w:t>Validação local do A1 concluída; ainda falta certificado real do emissor e comunicação TLS real.</w:t>
             </w:r>
           </w:p>
         </w:tc>
@@ -2961,15 +2916,8 @@
             <w:vAlign w:val="center"/>
           </w:tcPr>
           <w:p>
-            <w:pPr>
-              <w:spacing w:after="0"/>
-            </w:pPr>
             <w:r>
-              <w:rPr>
-                <w:rFonts w:ascii="Aptos" w:hAnsi="Aptos"/>
-                <w:sz w:val="18"/>
-              </w:rPr>
-              <w:t>PENDENTE</w:t>
+              <w:t>N/A</w:t>
             </w:r>
           </w:p>
         </w:tc>
@@ -2986,15 +2934,8 @@
             <w:vAlign w:val="center"/>
           </w:tcPr>
           <w:p>
-            <w:pPr>
-              <w:spacing w:after="0"/>
-            </w:pPr>
             <w:r>
-              <w:rPr>
-                <w:rFonts w:ascii="Aptos" w:hAnsi="Aptos"/>
-                <w:sz w:val="18"/>
-              </w:rPr>
-              <w:t>Obter/confirmar no ambiente de homologação e salvar na configuração.</w:t>
+              <w:t>Substituído no fluxo online pelo QR Code v3; CSC/ID CSC não é requisito desse fluxo.</w:t>
             </w:r>
           </w:p>
         </w:tc>
@@ -3060,14 +3001,7 @@
             <w:vAlign w:val="center"/>
           </w:tcPr>
           <w:p>
-            <w:pPr>
-              <w:spacing w:after="0"/>
-            </w:pPr>
             <w:r>
-              <w:rPr>
-                <w:rFonts w:ascii="Aptos" w:hAnsi="Aptos"/>
-                <w:sz w:val="18"/>
-              </w:rPr>
               <w:t>PENDENTE</w:t>
             </w:r>
           </w:p>
@@ -3084,15 +3018,8 @@
             <w:vAlign w:val="center"/>
           </w:tcPr>
           <w:p>
-            <w:pPr>
-              <w:spacing w:after="0"/>
-            </w:pPr>
             <w:r>
-              <w:rPr>
-                <w:rFonts w:ascii="Aptos" w:hAnsi="Aptos"/>
-                <w:sz w:val="18"/>
-              </w:rPr>
-              <w:t>Executar e guardar retorno; sucesso esperado do serviço.</w:t>
+              <w:t>Exige certificado/credenciais reais e execução contra a SEF/MG.</w:t>
             </w:r>
           </w:p>
         </w:tc>
@@ -3161,15 +3088,8 @@
             <w:vAlign w:val="center"/>
           </w:tcPr>
           <w:p>
-            <w:pPr>
-              <w:spacing w:after="0"/>
-            </w:pPr>
             <w:r>
-              <w:rPr>
-                <w:rFonts w:ascii="Aptos" w:hAnsi="Aptos"/>
-                <w:sz w:val="18"/>
-              </w:rPr>
-              <w:t>PENDENTE</w:t>
+              <w:t>CONCLUÍDO</w:t>
             </w:r>
           </w:p>
         </w:tc>
@@ -3186,15 +3106,8 @@
             <w:vAlign w:val="center"/>
           </w:tcPr>
           <w:p>
-            <w:pPr>
-              <w:spacing w:after="0"/>
-            </w:pPr>
             <w:r>
-              <w:rPr>
-                <w:rFonts w:ascii="Aptos" w:hAnsi="Aptos"/>
-                <w:sz w:val="18"/>
-              </w:rPr>
-              <w:t>Validar antes do envio e também o XML efetivamente transmitido.</w:t>
+              <w:t>Validação XSD implementada e testada com a NFC-e assinada contra o PL_010f; regressão integral aprovada.</w:t>
             </w:r>
           </w:p>
         </w:tc>
@@ -3260,15 +3173,8 @@
             <w:vAlign w:val="center"/>
           </w:tcPr>
           <w:p>
-            <w:pPr>
-              <w:spacing w:after="0"/>
-            </w:pPr>
             <w:r>
-              <w:rPr>
-                <w:rFonts w:ascii="Aptos" w:hAnsi="Aptos"/>
-                <w:sz w:val="18"/>
-              </w:rPr>
-              <w:t>PENDENTE</w:t>
+              <w:t>CONCLUÍDO LOCALMENTE</w:t>
             </w:r>
           </w:p>
         </w:tc>
@@ -3284,15 +3190,8 @@
             <w:vAlign w:val="center"/>
           </w:tcPr>
           <w:p>
-            <w:pPr>
-              <w:spacing w:after="0"/>
-            </w:pPr>
             <w:r>
-              <w:rPr>
-                <w:rFonts w:ascii="Aptos" w:hAnsi="Aptos"/>
-                <w:sz w:val="18"/>
-              </w:rPr>
-              <w:t>Confirmar assinatura válida com o certificado utilizado pelo SystemPro.</w:t>
+              <w:t>XMLDSig implementada e validada localmente; falta prova com A1 real.</w:t>
             </w:r>
           </w:p>
         </w:tc>
@@ -3361,15 +3260,8 @@
             <w:vAlign w:val="center"/>
           </w:tcPr>
           <w:p>
-            <w:pPr>
-              <w:spacing w:after="0"/>
-            </w:pPr>
             <w:r>
-              <w:rPr>
-                <w:rFonts w:ascii="Aptos" w:hAnsi="Aptos"/>
-                <w:sz w:val="18"/>
-              </w:rPr>
-              <w:t>PENDENTE</w:t>
+              <w:t>BLOQUEADO</w:t>
             </w:r>
           </w:p>
         </w:tc>
@@ -3386,15 +3278,8 @@
             <w:vAlign w:val="center"/>
           </w:tcPr>
           <w:p>
-            <w:pPr>
-              <w:spacing w:after="0"/>
-            </w:pPr>
             <w:r>
-              <w:rPr>
-                <w:rFonts w:ascii="Aptos" w:hAnsi="Aptos"/>
-                <w:sz w:val="18"/>
-              </w:rPr>
-              <w:t>Emitir uma NFC-e de teste.</w:t>
+              <w:t>Exige A1/CNPJ/credenciamento reais para NFeAutorizacao4 em homologação.</w:t>
             </w:r>
           </w:p>
         </w:tc>
@@ -3460,15 +3345,8 @@
             <w:vAlign w:val="center"/>
           </w:tcPr>
           <w:p>
-            <w:pPr>
-              <w:spacing w:after="0"/>
-            </w:pPr>
             <w:r>
-              <w:rPr>
-                <w:rFonts w:ascii="Aptos" w:hAnsi="Aptos"/>
-                <w:sz w:val="18"/>
-              </w:rPr>
-              <w:t>PENDENTE</w:t>
+              <w:t>BLOQUEADO</w:t>
             </w:r>
           </w:p>
         </w:tc>
@@ -3484,15 +3362,8 @@
             <w:vAlign w:val="center"/>
           </w:tcPr>
           <w:p>
-            <w:pPr>
-              <w:spacing w:after="0"/>
-            </w:pPr>
             <w:r>
-              <w:rPr>
-                <w:rFonts w:ascii="Aptos" w:hAnsi="Aptos"/>
-                <w:sz w:val="18"/>
-              </w:rPr>
-              <w:t>Guardar chave, protocolo e retorno.</w:t>
+              <w:t>Exige autorização efetiva de uma NFC-e pela SEF/MG em homologação.</w:t>
             </w:r>
           </w:p>
         </w:tc>
@@ -3561,15 +3432,8 @@
             <w:vAlign w:val="center"/>
           </w:tcPr>
           <w:p>
-            <w:pPr>
-              <w:spacing w:after="0"/>
-            </w:pPr>
             <w:r>
-              <w:rPr>
-                <w:rFonts w:ascii="Aptos" w:hAnsi="Aptos"/>
-                <w:sz w:val="18"/>
-              </w:rPr>
-              <w:t>PENDENTE</w:t>
+              <w:t>CONCLUÍDO</w:t>
             </w:r>
           </w:p>
         </w:tc>
@@ -3586,15 +3450,8 @@
             <w:vAlign w:val="center"/>
           </w:tcPr>
           <w:p>
-            <w:pPr>
-              <w:spacing w:after="0"/>
-            </w:pPr>
             <w:r>
-              <w:rPr>
-                <w:rFonts w:ascii="Aptos" w:hAnsi="Aptos"/>
-                <w:sz w:val="18"/>
-              </w:rPr>
-              <w:t>Conferir banco, API e recuperação do documento.</w:t>
+              <w:t>Integração PostgreSQL confirmou status, chave, XML, resposta, protocolo e issuedAt após commit.</w:t>
             </w:r>
           </w:p>
         </w:tc>
@@ -3660,15 +3517,8 @@
             <w:vAlign w:val="center"/>
           </w:tcPr>
           <w:p>
-            <w:pPr>
-              <w:spacing w:after="0"/>
-            </w:pPr>
             <w:r>
-              <w:rPr>
-                <w:rFonts w:ascii="Aptos" w:hAnsi="Aptos"/>
-                <w:sz w:val="18"/>
-              </w:rPr>
-              <w:t>PENDENTE</w:t>
+              <w:t>CONCLUÍDO</w:t>
             </w:r>
           </w:p>
         </w:tc>
@@ -3684,15 +3534,8 @@
             <w:vAlign w:val="center"/>
           </w:tcPr>
           <w:p>
-            <w:pPr>
-              <w:spacing w:after="0"/>
-            </w:pPr>
             <w:r>
-              <w:rPr>
-                <w:rFonts w:ascii="Aptos" w:hAnsi="Aptos"/>
-                <w:sz w:val="18"/>
-              </w:rPr>
-              <w:t>Consultar documento já autorizado.</w:t>
+              <w:t>Consulta testada: autorizada, rejeitada, inconclusiva e falha local; sem retransmissão indevida.</w:t>
             </w:r>
           </w:p>
         </w:tc>
@@ -3761,15 +3604,8 @@
             <w:vAlign w:val="center"/>
           </w:tcPr>
           <w:p>
-            <w:pPr>
-              <w:spacing w:after="0"/>
-            </w:pPr>
             <w:r>
-              <w:rPr>
-                <w:rFonts w:ascii="Aptos" w:hAnsi="Aptos"/>
-                <w:sz w:val="18"/>
-              </w:rPr>
-              <w:t>PENDENTE</w:t>
+              <w:t>CONCLUÍDO LOCALMENTE</w:t>
             </w:r>
           </w:p>
         </w:tc>
@@ -3786,15 +3622,8 @@
             <w:vAlign w:val="center"/>
           </w:tcPr>
           <w:p>
-            <w:pPr>
-              <w:spacing w:after="0"/>
-            </w:pPr>
             <w:r>
-              <w:rPr>
-                <w:rFonts w:ascii="Aptos" w:hAnsi="Aptos"/>
-                <w:sz w:val="18"/>
-              </w:rPr>
-              <w:t>Conferir dados fiscais e apresentação.</w:t>
+              <w:t>DANFE NFC-e 80 mm implementado e testado. A NT 2026.010 foi revisada e considerada não aplicável ao DANFE NFC-e modelo 65.</w:t>
             </w:r>
           </w:p>
         </w:tc>
@@ -3860,15 +3689,8 @@
             <w:vAlign w:val="center"/>
           </w:tcPr>
           <w:p>
-            <w:pPr>
-              <w:spacing w:after="0"/>
-            </w:pPr>
             <w:r>
-              <w:rPr>
-                <w:rFonts w:ascii="Aptos" w:hAnsi="Aptos"/>
-                <w:sz w:val="18"/>
-              </w:rPr>
-              <w:t>PENDENTE</w:t>
+              <w:t>CONCLUÍDO</w:t>
             </w:r>
           </w:p>
         </w:tc>
@@ -3884,15 +3706,8 @@
             <w:vAlign w:val="center"/>
           </w:tcPr>
           <w:p>
-            <w:pPr>
-              <w:spacing w:after="0"/>
-            </w:pPr>
             <w:r>
-              <w:rPr>
-                <w:rFonts w:ascii="Aptos" w:hAnsi="Aptos"/>
-                <w:sz w:val="18"/>
-              </w:rPr>
-              <w:t>Testar leitura e consulta no portal de homologação.</w:t>
+              <w:t>QR Code NFC-e v3 online implementado/testado e integrado ao XML antes de XSD/assinatura.</w:t>
             </w:r>
           </w:p>
         </w:tc>
@@ -3961,15 +3776,8 @@
             <w:vAlign w:val="center"/>
           </w:tcPr>
           <w:p>
-            <w:pPr>
-              <w:spacing w:after="0"/>
-            </w:pPr>
             <w:r>
-              <w:rPr>
-                <w:rFonts w:ascii="Aptos" w:hAnsi="Aptos"/>
-                <w:sz w:val="18"/>
-              </w:rPr>
-              <w:t>PENDENTE</w:t>
+              <w:t>CONCLUÍDO LOCALMENTE</w:t>
             </w:r>
           </w:p>
         </w:tc>
@@ -3986,15 +3794,8 @@
             <w:vAlign w:val="center"/>
           </w:tcPr>
           <w:p>
-            <w:pPr>
-              <w:spacing w:after="0"/>
-            </w:pPr>
             <w:r>
-              <w:rPr>
-                <w:rFonts w:ascii="Aptos" w:hAnsi="Aptos"/>
-                <w:sz w:val="18"/>
-              </w:rPr>
-              <w:t>Cancelar NFC-e de teste e conferir protocolo/status.</w:t>
+              <w:t>Cancelamento e estados de comunicação testados; falta evento real em homologação.</w:t>
             </w:r>
           </w:p>
         </w:tc>
@@ -4060,15 +3861,8 @@
             <w:vAlign w:val="center"/>
           </w:tcPr>
           <w:p>
-            <w:pPr>
-              <w:spacing w:after="0"/>
-            </w:pPr>
             <w:r>
-              <w:rPr>
-                <w:rFonts w:ascii="Aptos" w:hAnsi="Aptos"/>
-                <w:sz w:val="18"/>
-              </w:rPr>
-              <w:t>PENDENTE</w:t>
+              <w:t>CONCLUÍDO LOCALMENTE</w:t>
             </w:r>
           </w:p>
         </w:tc>
@@ -4084,15 +3878,8 @@
             <w:vAlign w:val="center"/>
           </w:tcPr>
           <w:p>
-            <w:pPr>
-              <w:spacing w:after="0"/>
-            </w:pPr>
             <w:r>
-              <w:rPr>
-                <w:rFonts w:ascii="Aptos" w:hAnsi="Aptos"/>
-                <w:sz w:val="18"/>
-              </w:rPr>
-              <w:t>Executar cenário controlado e conferir mensagem segura.</w:t>
+              <w:t>A1: válido, expirado, ainda não válido, senha/PKCS#12 e chave/certificado testados.</w:t>
             </w:r>
           </w:p>
         </w:tc>
@@ -4161,15 +3948,8 @@
             <w:vAlign w:val="center"/>
           </w:tcPr>
           <w:p>
-            <w:pPr>
-              <w:spacing w:after="0"/>
-            </w:pPr>
             <w:r>
-              <w:rPr>
-                <w:rFonts w:ascii="Aptos" w:hAnsi="Aptos"/>
-                <w:sz w:val="18"/>
-              </w:rPr>
-              <w:t>PENDENTE</w:t>
+              <w:t>N/A</w:t>
             </w:r>
           </w:p>
         </w:tc>
@@ -4186,15 +3966,8 @@
             <w:vAlign w:val="center"/>
           </w:tcPr>
           <w:p>
-            <w:pPr>
-              <w:spacing w:after="0"/>
-            </w:pPr>
             <w:r>
-              <w:rPr>
-                <w:rFonts w:ascii="Aptos" w:hAnsi="Aptos"/>
-                <w:sz w:val="18"/>
-              </w:rPr>
-              <w:t>Executar cenário controlado sem comprometer dados de produção.</w:t>
+              <w:t>Rejeição por CSC não se aplica ao fluxo QR Code v3 online adotado.</w:t>
             </w:r>
           </w:p>
         </w:tc>
@@ -4260,15 +4033,8 @@
             <w:vAlign w:val="center"/>
           </w:tcPr>
           <w:p>
-            <w:pPr>
-              <w:spacing w:after="0"/>
-            </w:pPr>
             <w:r>
-              <w:rPr>
-                <w:rFonts w:ascii="Aptos" w:hAnsi="Aptos"/>
-                <w:sz w:val="18"/>
-              </w:rPr>
-              <w:t>PENDENTE</w:t>
+              <w:t>CONCLUÍDO</w:t>
             </w:r>
           </w:p>
         </w:tc>
@@ -4284,15 +4050,8 @@
             <w:vAlign w:val="center"/>
           </w:tcPr>
           <w:p>
-            <w:pPr>
-              <w:spacing w:after="0"/>
-            </w:pPr>
             <w:r>
-              <w:rPr>
-                <w:rFonts w:ascii="Aptos" w:hAnsi="Aptos"/>
-                <w:sz w:val="18"/>
-              </w:rPr>
-              <w:t>Validar tratamento de retorno e integridade da venda.</w:t>
+              <w:t>Validações fiscais do produto e integração RTC/IBS/CBS testadas; rejeições não persistem venda nem consomem numeração indevidamente.</w:t>
             </w:r>
           </w:p>
         </w:tc>
@@ -4361,15 +4120,8 @@
             <w:vAlign w:val="center"/>
           </w:tcPr>
           <w:p>
-            <w:pPr>
-              <w:spacing w:after="0"/>
-            </w:pPr>
             <w:r>
-              <w:rPr>
-                <w:rFonts w:ascii="Aptos" w:hAnsi="Aptos"/>
-                <w:sz w:val="18"/>
-              </w:rPr>
-              <w:t>PENDENTE</w:t>
+              <w:t>CONCLUÍDO</w:t>
             </w:r>
           </w:p>
         </w:tc>
@@ -4386,15 +4138,8 @@
             <w:vAlign w:val="center"/>
           </w:tcPr>
           <w:p>
-            <w:pPr>
-              <w:spacing w:after="0"/>
-            </w:pPr>
             <w:r>
-              <w:rPr>
-                <w:rFonts w:ascii="Aptos" w:hAnsi="Aptos"/>
-                <w:sz w:val="18"/>
-              </w:rPr>
-              <w:t>Confirmar sequência, recuperação de falha e prevenção de duplicidade.</w:t>
+              <w:t>Concorrência PostgreSQL, lock, rollback, série e UNIQUE validados.</w:t>
             </w:r>
           </w:p>
         </w:tc>
@@ -4460,15 +4205,8 @@
             <w:vAlign w:val="center"/>
           </w:tcPr>
           <w:p>
-            <w:pPr>
-              <w:spacing w:after="0"/>
-            </w:pPr>
             <w:r>
-              <w:rPr>
-                <w:rFonts w:ascii="Aptos" w:hAnsi="Aptos"/>
-                <w:sz w:val="18"/>
-              </w:rPr>
-              <w:t>PENDENTE</w:t>
+              <w:t>CONCLUÍDO</w:t>
             </w:r>
           </w:p>
         </w:tc>
@@ -4484,15 +4222,8 @@
             <w:vAlign w:val="center"/>
           </w:tcPr>
           <w:p>
-            <w:pPr>
-              <w:spacing w:after="0"/>
-            </w:pPr>
             <w:r>
-              <w:rPr>
-                <w:rFonts w:ascii="Aptos" w:hAnsi="Aptos"/>
-                <w:sz w:val="18"/>
-              </w:rPr>
-              <w:t>Verificar que venda/documento não fica em estado inconsistente.</w:t>
+              <w:t>Falha local separada de resultado indeterminado; timeout/comunicação com estado consistente.</w:t>
             </w:r>
           </w:p>
         </w:tc>
@@ -4561,15 +4292,8 @@
             <w:vAlign w:val="center"/>
           </w:tcPr>
           <w:p>
-            <w:pPr>
-              <w:spacing w:after="0"/>
-            </w:pPr>
             <w:r>
-              <w:rPr>
-                <w:rFonts w:ascii="Aptos" w:hAnsi="Aptos"/>
-                <w:sz w:val="18"/>
-              </w:rPr>
-              <w:t>PENDENTE</w:t>
+              <w:t>CONCLUÍDO LOCALMENTE</w:t>
             </w:r>
           </w:p>
         </w:tc>
@@ -4586,15 +4310,638 @@
             <w:vAlign w:val="center"/>
           </w:tcPr>
           <w:p>
-            <w:pPr>
-              <w:spacing w:after="0"/>
-            </w:pPr>
             <w:r>
-              <w:rPr>
-                <w:rFonts w:ascii="Aptos" w:hAnsi="Aptos"/>
-                <w:sz w:val="18"/>
-              </w:rPr>
-              <w:t>Conferir leiaute/regras aplicáveis, especialmente RTC e NTs publicadas em 2026.</w:t>
+              <w:t>Revisão RTC/NTs 2026 concluída no limite aplicável atual; manter monitoramento da NT 2026.008 e de novo pacote XSD.</w:t>
+            </w:r>
+          </w:p>
+        </w:tc>
+      </w:tr>
+      <w:tr>
+        <w:tc>
+          <w:tcPr>
+            <w:tcW w:type="dxa" w:w="547"/>
+            <w:tcMar>
+              <w:top w:w="80" w:type="dxa"/>
+              <w:start w:w="100" w:type="dxa"/>
+              <w:bottom w:w="80" w:type="dxa"/>
+              <w:end w:w="100" w:type="dxa"/>
+            </w:tcMar>
+            <w:vAlign w:val="center"/>
+          </w:tcPr>
+          <w:p>
+            <w:r>
+              <w:t>24.1</w:t>
+            </w:r>
+          </w:p>
+        </w:tc>
+        <w:tc>
+          <w:tcPr>
+            <w:tcW w:type="dxa" w:w="3672"/>
+            <w:tcMar>
+              <w:top w:w="80" w:type="dxa"/>
+              <w:start w:w="100" w:type="dxa"/>
+              <w:bottom w:w="80" w:type="dxa"/>
+              <w:end w:w="100" w:type="dxa"/>
+            </w:tcMar>
+            <w:vAlign w:val="center"/>
+          </w:tcPr>
+          <w:p>
+            <w:r>
+              <w:t>CRT/regime tributário do emitente</w:t>
+            </w:r>
+          </w:p>
+        </w:tc>
+        <w:tc>
+          <w:tcPr>
+            <w:tcW w:type="dxa" w:w="1224"/>
+            <w:tcMar>
+              <w:top w:w="80" w:type="dxa"/>
+              <w:start w:w="100" w:type="dxa"/>
+              <w:bottom w:w="80" w:type="dxa"/>
+              <w:end w:w="100" w:type="dxa"/>
+            </w:tcMar>
+            <w:vAlign w:val="center"/>
+          </w:tcPr>
+          <w:p>
+            <w:r>
+              <w:t>CONCLUÍDO</w:t>
+            </w:r>
+          </w:p>
+        </w:tc>
+        <w:tc>
+          <w:tcPr>
+            <w:tcW w:type="dxa" w:w="4925"/>
+            <w:tcMar>
+              <w:top w:w="80" w:type="dxa"/>
+              <w:start w:w="100" w:type="dxa"/>
+              <w:bottom w:w="80" w:type="dxa"/>
+              <w:end w:w="100" w:type="dxa"/>
+            </w:tcMar>
+            <w:vAlign w:val="center"/>
+          </w:tcPr>
+          <w:p>
+            <w:r>
+              <w:t>CRT/regime explicitamente modelado; comportamento por regime e uso de CSOSN validados.</w:t>
+            </w:r>
+          </w:p>
+        </w:tc>
+      </w:tr>
+      <w:tr>
+        <w:tc>
+          <w:tcPr>
+            <w:tcW w:type="dxa" w:w="547"/>
+            <w:tcMar>
+              <w:top w:w="80" w:type="dxa"/>
+              <w:start w:w="100" w:type="dxa"/>
+              <w:bottom w:w="80" w:type="dxa"/>
+              <w:end w:w="100" w:type="dxa"/>
+            </w:tcMar>
+            <w:vAlign w:val="center"/>
+          </w:tcPr>
+          <w:p>
+            <w:r>
+              <w:t>24.2</w:t>
+            </w:r>
+          </w:p>
+        </w:tc>
+        <w:tc>
+          <w:tcPr>
+            <w:tcW w:type="dxa" w:w="3672"/>
+            <w:tcMar>
+              <w:top w:w="80" w:type="dxa"/>
+              <w:start w:w="100" w:type="dxa"/>
+              <w:bottom w:w="80" w:type="dxa"/>
+              <w:end w:w="100" w:type="dxa"/>
+            </w:tcMar>
+            <w:vAlign w:val="center"/>
+          </w:tcPr>
+          <w:p>
+            <w:r>
+              <w:t>Modelo fiscal IBS/CBS por produto/operação</w:t>
+            </w:r>
+          </w:p>
+        </w:tc>
+        <w:tc>
+          <w:tcPr>
+            <w:tcW w:type="dxa" w:w="1224"/>
+            <w:tcMar>
+              <w:top w:w="80" w:type="dxa"/>
+              <w:start w:w="100" w:type="dxa"/>
+              <w:bottom w:w="80" w:type="dxa"/>
+              <w:end w:w="100" w:type="dxa"/>
+            </w:tcMar>
+            <w:vAlign w:val="center"/>
+          </w:tcPr>
+          <w:p>
+            <w:r>
+              <w:t>CONCLUÍDO</w:t>
+            </w:r>
+          </w:p>
+        </w:tc>
+        <w:tc>
+          <w:tcPr>
+            <w:tcW w:type="dxa" w:w="4925"/>
+            <w:tcMar>
+              <w:top w:w="80" w:type="dxa"/>
+              <w:start w:w="100" w:type="dxa"/>
+              <w:bottom w:w="80" w:type="dxa"/>
+              <w:end w:w="100" w:type="dxa"/>
+            </w:tcMar>
+            <w:vAlign w:val="center"/>
+          </w:tcPr>
+          <w:p>
+            <w:r>
+              <w:t>Modelo de cálculo IBS/CBS separado da classificação fiscal, com snapshot calculado por operação e testes automatizados.</w:t>
+            </w:r>
+          </w:p>
+        </w:tc>
+      </w:tr>
+      <w:tr>
+        <w:tc>
+          <w:tcPr>
+            <w:tcW w:type="dxa" w:w="547"/>
+            <w:tcMar>
+              <w:top w:w="80" w:type="dxa"/>
+              <w:start w:w="100" w:type="dxa"/>
+              <w:bottom w:w="80" w:type="dxa"/>
+              <w:end w:w="100" w:type="dxa"/>
+            </w:tcMar>
+            <w:vAlign w:val="center"/>
+          </w:tcPr>
+          <w:p>
+            <w:r>
+              <w:t>24.3</w:t>
+            </w:r>
+          </w:p>
+        </w:tc>
+        <w:tc>
+          <w:tcPr>
+            <w:tcW w:type="dxa" w:w="3672"/>
+            <w:tcMar>
+              <w:top w:w="80" w:type="dxa"/>
+              <w:start w:w="100" w:type="dxa"/>
+              <w:bottom w:w="80" w:type="dxa"/>
+              <w:end w:w="100" w:type="dxa"/>
+            </w:tcMar>
+            <w:vAlign w:val="center"/>
+          </w:tcPr>
+          <w:p>
+            <w:r>
+              <w:t>CST IBS/CBS + cClassTrib</w:t>
+            </w:r>
+          </w:p>
+        </w:tc>
+        <w:tc>
+          <w:tcPr>
+            <w:tcW w:type="dxa" w:w="1224"/>
+            <w:tcMar>
+              <w:top w:w="80" w:type="dxa"/>
+              <w:start w:w="100" w:type="dxa"/>
+              <w:bottom w:w="80" w:type="dxa"/>
+              <w:end w:w="100" w:type="dxa"/>
+            </w:tcMar>
+            <w:vAlign w:val="center"/>
+          </w:tcPr>
+          <w:p>
+            <w:r>
+              <w:t>CONCLUÍDO</w:t>
+            </w:r>
+          </w:p>
+        </w:tc>
+        <w:tc>
+          <w:tcPr>
+            <w:tcW w:type="dxa" w:w="4925"/>
+            <w:tcMar>
+              <w:top w:w="80" w:type="dxa"/>
+              <w:start w:w="100" w:type="dxa"/>
+              <w:bottom w:w="80" w:type="dxa"/>
+              <w:end w:w="100" w:type="dxa"/>
+            </w:tcMar>
+            <w:vAlign w:val="center"/>
+          </w:tcPr>
+          <w:p>
+            <w:r>
+              <w:t>CST IBS/CBS e cClassTrib validados contra catálogo dinâmico oficial importado da IT 2025.002 v1.70; 173 registros carregados.</w:t>
+            </w:r>
+          </w:p>
+        </w:tc>
+      </w:tr>
+      <w:tr>
+        <w:tc>
+          <w:tcPr>
+            <w:tcW w:type="dxa" w:w="547"/>
+            <w:tcMar>
+              <w:top w:w="80" w:type="dxa"/>
+              <w:start w:w="100" w:type="dxa"/>
+              <w:bottom w:w="80" w:type="dxa"/>
+              <w:end w:w="100" w:type="dxa"/>
+            </w:tcMar>
+            <w:vAlign w:val="center"/>
+          </w:tcPr>
+          <w:p>
+            <w:r>
+              <w:t>24.4</w:t>
+            </w:r>
+          </w:p>
+        </w:tc>
+        <w:tc>
+          <w:tcPr>
+            <w:tcW w:type="dxa" w:w="3672"/>
+            <w:tcMar>
+              <w:top w:w="80" w:type="dxa"/>
+              <w:start w:w="100" w:type="dxa"/>
+              <w:bottom w:w="80" w:type="dxa"/>
+              <w:end w:w="100" w:type="dxa"/>
+            </w:tcMar>
+            <w:vAlign w:val="center"/>
+          </w:tcPr>
+          <w:p>
+            <w:r>
+              <w:t>Serialização IBSCBS no XML</w:t>
+            </w:r>
+          </w:p>
+        </w:tc>
+        <w:tc>
+          <w:tcPr>
+            <w:tcW w:type="dxa" w:w="1224"/>
+            <w:tcMar>
+              <w:top w:w="80" w:type="dxa"/>
+              <w:start w:w="100" w:type="dxa"/>
+              <w:bottom w:w="80" w:type="dxa"/>
+              <w:end w:w="100" w:type="dxa"/>
+            </w:tcMar>
+            <w:vAlign w:val="center"/>
+          </w:tcPr>
+          <w:p>
+            <w:r>
+              <w:t>CONCLUÍDO</w:t>
+            </w:r>
+          </w:p>
+        </w:tc>
+        <w:tc>
+          <w:tcPr>
+            <w:tcW w:type="dxa" w:w="4925"/>
+            <w:tcMar>
+              <w:top w:w="80" w:type="dxa"/>
+              <w:start w:w="100" w:type="dxa"/>
+              <w:bottom w:w="80" w:type="dxa"/>
+              <w:end w:w="100" w:type="dxa"/>
+            </w:tcMar>
+            <w:vAlign w:val="center"/>
+          </w:tcPr>
+          <w:p>
+            <w:r>
+              <w:t>Snapshot RTC persistido no SaleItem e grupo IBSCBS serializado a partir do snapshot, sem redescoberta de regra no gateway.</w:t>
+            </w:r>
+          </w:p>
+        </w:tc>
+      </w:tr>
+      <w:tr>
+        <w:tc>
+          <w:tcPr>
+            <w:tcW w:type="dxa" w:w="547"/>
+            <w:tcMar>
+              <w:top w:w="80" w:type="dxa"/>
+              <w:start w:w="100" w:type="dxa"/>
+              <w:bottom w:w="80" w:type="dxa"/>
+              <w:end w:w="100" w:type="dxa"/>
+            </w:tcMar>
+            <w:vAlign w:val="center"/>
+          </w:tcPr>
+          <w:p>
+            <w:r>
+              <w:t>24.5</w:t>
+            </w:r>
+          </w:p>
+        </w:tc>
+        <w:tc>
+          <w:tcPr>
+            <w:tcW w:type="dxa" w:w="3672"/>
+            <w:tcMar>
+              <w:top w:w="80" w:type="dxa"/>
+              <w:start w:w="100" w:type="dxa"/>
+              <w:bottom w:w="80" w:type="dxa"/>
+              <w:end w:w="100" w:type="dxa"/>
+            </w:tcMar>
+            <w:vAlign w:val="center"/>
+          </w:tcPr>
+          <w:p>
+            <w:r>
+              <w:t>Totalização IBSCBSTot / totais RTC</w:t>
+            </w:r>
+          </w:p>
+        </w:tc>
+        <w:tc>
+          <w:tcPr>
+            <w:tcW w:type="dxa" w:w="1224"/>
+            <w:tcMar>
+              <w:top w:w="80" w:type="dxa"/>
+              <w:start w:w="100" w:type="dxa"/>
+              <w:bottom w:w="80" w:type="dxa"/>
+              <w:end w:w="100" w:type="dxa"/>
+            </w:tcMar>
+            <w:vAlign w:val="center"/>
+          </w:tcPr>
+          <w:p>
+            <w:r>
+              <w:t>CONCLUÍDO</w:t>
+            </w:r>
+          </w:p>
+        </w:tc>
+        <w:tc>
+          <w:tcPr>
+            <w:tcW w:type="dxa" w:w="4925"/>
+            <w:tcMar>
+              <w:top w:w="80" w:type="dxa"/>
+              <w:start w:w="100" w:type="dxa"/>
+              <w:bottom w:w="80" w:type="dxa"/>
+              <w:end w:w="100" w:type="dxa"/>
+            </w:tcMar>
+            <w:vAlign w:val="center"/>
+          </w:tcPr>
+          <w:p>
+            <w:r>
+              <w:t>IBSCBSTot implementado e testado; totalização considera apenas itens com snapshot RTC e preserva itens não RTC.</w:t>
+            </w:r>
+          </w:p>
+        </w:tc>
+      </w:tr>
+      <w:tr>
+        <w:tc>
+          <w:tcPr>
+            <w:tcW w:type="dxa" w:w="547"/>
+            <w:tcMar>
+              <w:top w:w="80" w:type="dxa"/>
+              <w:start w:w="100" w:type="dxa"/>
+              <w:bottom w:w="80" w:type="dxa"/>
+              <w:end w:w="100" w:type="dxa"/>
+            </w:tcMar>
+            <w:vAlign w:val="center"/>
+          </w:tcPr>
+          <w:p>
+            <w:r>
+              <w:t>24.6</w:t>
+            </w:r>
+          </w:p>
+        </w:tc>
+        <w:tc>
+          <w:tcPr>
+            <w:tcW w:type="dxa" w:w="3672"/>
+            <w:tcMar>
+              <w:top w:w="80" w:type="dxa"/>
+              <w:start w:w="100" w:type="dxa"/>
+              <w:bottom w:w="80" w:type="dxa"/>
+              <w:end w:w="100" w:type="dxa"/>
+            </w:tcMar>
+            <w:vAlign w:val="center"/>
+          </w:tcPr>
+          <w:p>
+            <w:r>
+              <w:t>NT 2025.002 v1.52 / schemas e regras</w:t>
+            </w:r>
+          </w:p>
+        </w:tc>
+        <w:tc>
+          <w:tcPr>
+            <w:tcW w:type="dxa" w:w="1224"/>
+            <w:tcMar>
+              <w:top w:w="80" w:type="dxa"/>
+              <w:start w:w="100" w:type="dxa"/>
+              <w:bottom w:w="80" w:type="dxa"/>
+              <w:end w:w="100" w:type="dxa"/>
+            </w:tcMar>
+            <w:vAlign w:val="center"/>
+          </w:tcPr>
+          <w:p>
+            <w:r>
+              <w:t>CONCLUÍDO</w:t>
+            </w:r>
+          </w:p>
+        </w:tc>
+        <w:tc>
+          <w:tcPr>
+            <w:tcW w:type="dxa" w:w="4925"/>
+            <w:tcMar>
+              <w:top w:w="80" w:type="dxa"/>
+              <w:start w:w="100" w:type="dxa"/>
+              <w:bottom w:w="80" w:type="dxa"/>
+              <w:end w:w="100" w:type="dxa"/>
+            </w:tcMar>
+            <w:vAlign w:val="center"/>
+          </w:tcPr>
+          <w:p>
+            <w:r>
+              <w:t>NFC-e completa e assinada validada contra o PL_010f, incluindo XMLDSig/X509Data, IBSCBS, IBSCBSTot, múltiplos itens e desconto.</w:t>
+            </w:r>
+          </w:p>
+        </w:tc>
+      </w:tr>
+      <w:tr>
+        <w:tc>
+          <w:tcPr>
+            <w:tcW w:type="dxa" w:w="547"/>
+            <w:tcMar>
+              <w:top w:w="80" w:type="dxa"/>
+              <w:start w:w="100" w:type="dxa"/>
+              <w:bottom w:w="80" w:type="dxa"/>
+              <w:end w:w="100" w:type="dxa"/>
+            </w:tcMar>
+            <w:vAlign w:val="center"/>
+          </w:tcPr>
+          <w:p>
+            <w:r>
+              <w:t>24.7</w:t>
+            </w:r>
+          </w:p>
+        </w:tc>
+        <w:tc>
+          <w:tcPr>
+            <w:tcW w:type="dxa" w:w="3672"/>
+            <w:tcMar>
+              <w:top w:w="80" w:type="dxa"/>
+              <w:start w:w="100" w:type="dxa"/>
+              <w:bottom w:w="80" w:type="dxa"/>
+              <w:end w:w="100" w:type="dxa"/>
+            </w:tcMar>
+            <w:vAlign w:val="center"/>
+          </w:tcPr>
+          <w:p>
+            <w:r>
+              <w:t>DANFE conforme NT 2026.010</w:t>
+            </w:r>
+          </w:p>
+        </w:tc>
+        <w:tc>
+          <w:tcPr>
+            <w:tcW w:type="dxa" w:w="1224"/>
+            <w:tcMar>
+              <w:top w:w="80" w:type="dxa"/>
+              <w:start w:w="100" w:type="dxa"/>
+              <w:bottom w:w="80" w:type="dxa"/>
+              <w:end w:w="100" w:type="dxa"/>
+            </w:tcMar>
+            <w:vAlign w:val="center"/>
+          </w:tcPr>
+          <w:p>
+            <w:r>
+              <w:t>N/A NFC-e 65</w:t>
+            </w:r>
+          </w:p>
+        </w:tc>
+        <w:tc>
+          <w:tcPr>
+            <w:tcW w:type="dxa" w:w="4925"/>
+            <w:tcMar>
+              <w:top w:w="80" w:type="dxa"/>
+              <w:start w:w="100" w:type="dxa"/>
+              <w:bottom w:w="80" w:type="dxa"/>
+              <w:end w:w="100" w:type="dxa"/>
+            </w:tcMar>
+            <w:vAlign w:val="center"/>
+          </w:tcPr>
+          <w:p>
+            <w:r>
+              <w:t>NT 2026.010 revisada: não aplicar o leiaute de DANFE NF-e modelo 55 ao DANFE NFC-e modelo 65.</w:t>
+            </w:r>
+          </w:p>
+        </w:tc>
+      </w:tr>
+      <w:tr>
+        <w:tc>
+          <w:tcPr>
+            <w:tcW w:type="dxa" w:w="547"/>
+            <w:tcMar>
+              <w:top w:w="80" w:type="dxa"/>
+              <w:start w:w="100" w:type="dxa"/>
+              <w:bottom w:w="80" w:type="dxa"/>
+              <w:end w:w="100" w:type="dxa"/>
+            </w:tcMar>
+            <w:vAlign w:val="center"/>
+          </w:tcPr>
+          <w:p>
+            <w:r>
+              <w:t>24.8</w:t>
+            </w:r>
+          </w:p>
+        </w:tc>
+        <w:tc>
+          <w:tcPr>
+            <w:tcW w:type="dxa" w:w="3672"/>
+            <w:tcMar>
+              <w:top w:w="80" w:type="dxa"/>
+              <w:start w:w="100" w:type="dxa"/>
+              <w:bottom w:w="80" w:type="dxa"/>
+              <w:end w:w="100" w:type="dxa"/>
+            </w:tcMar>
+            <w:vAlign w:val="center"/>
+          </w:tcPr>
+          <w:p>
+            <w:r>
+              <w:t>NT 2026.007 / NT 2026.008</w:t>
+            </w:r>
+          </w:p>
+        </w:tc>
+        <w:tc>
+          <w:tcPr>
+            <w:tcW w:type="dxa" w:w="1224"/>
+            <w:tcMar>
+              <w:top w:w="80" w:type="dxa"/>
+              <w:start w:w="100" w:type="dxa"/>
+              <w:bottom w:w="80" w:type="dxa"/>
+              <w:end w:w="100" w:type="dxa"/>
+            </w:tcMar>
+            <w:vAlign w:val="center"/>
+          </w:tcPr>
+          <w:p>
+            <w:r>
+              <w:t>CONCLUÍDO / MONITORAR</w:t>
+            </w:r>
+          </w:p>
+        </w:tc>
+        <w:tc>
+          <w:tcPr>
+            <w:tcW w:type="dxa" w:w="4925"/>
+            <w:tcMar>
+              <w:top w:w="80" w:type="dxa"/>
+              <w:start w:w="100" w:type="dxa"/>
+              <w:bottom w:w="80" w:type="dxa"/>
+              <w:end w:w="100" w:type="dxa"/>
+            </w:tcMar>
+            <w:vAlign w:val="center"/>
+          </w:tcPr>
+          <w:p>
+            <w:r>
+              <w:t>NT 2026.007/008 revisadas. Sem alteração insegura no XML atual; campos/regras futuros da NT 2026.008 aguardam pacote XSD compatível e implantação aplicável.</w:t>
+            </w:r>
+          </w:p>
+        </w:tc>
+      </w:tr>
+      <w:tr>
+        <w:tc>
+          <w:tcPr>
+            <w:tcW w:type="dxa" w:w="547"/>
+            <w:tcMar>
+              <w:top w:w="80" w:type="dxa"/>
+              <w:start w:w="100" w:type="dxa"/>
+              <w:bottom w:w="80" w:type="dxa"/>
+              <w:end w:w="100" w:type="dxa"/>
+            </w:tcMar>
+            <w:vAlign w:val="center"/>
+          </w:tcPr>
+          <w:p>
+            <w:r>
+              <w:t>24.9</w:t>
+            </w:r>
+          </w:p>
+        </w:tc>
+        <w:tc>
+          <w:tcPr>
+            <w:tcW w:type="dxa" w:w="3672"/>
+            <w:tcMar>
+              <w:top w:w="80" w:type="dxa"/>
+              <w:start w:w="100" w:type="dxa"/>
+              <w:bottom w:w="80" w:type="dxa"/>
+              <w:end w:w="100" w:type="dxa"/>
+            </w:tcMar>
+            <w:vAlign w:val="center"/>
+          </w:tcPr>
+          <w:p>
+            <w:r>
+              <w:t>Regressão fiscal completa</w:t>
+            </w:r>
+          </w:p>
+        </w:tc>
+        <w:tc>
+          <w:tcPr>
+            <w:tcW w:type="dxa" w:w="1224"/>
+            <w:tcMar>
+              <w:top w:w="80" w:type="dxa"/>
+              <w:start w:w="100" w:type="dxa"/>
+              <w:bottom w:w="80" w:type="dxa"/>
+              <w:end w:w="100" w:type="dxa"/>
+            </w:tcMar>
+            <w:vAlign w:val="center"/>
+          </w:tcPr>
+          <w:p>
+            <w:r>
+              <w:t>CONCLUÍDO</w:t>
+            </w:r>
+          </w:p>
+        </w:tc>
+        <w:tc>
+          <w:tcPr>
+            <w:tcW w:type="dxa" w:w="4925"/>
+            <w:tcMar>
+              <w:top w:w="80" w:type="dxa"/>
+              <w:start w:w="100" w:type="dxa"/>
+              <w:bottom w:w="80" w:type="dxa"/>
+              <w:end w:w="100" w:type="dxa"/>
+            </w:tcMar>
+            <w:vAlign w:val="center"/>
+          </w:tcPr>
+          <w:p>
+            <w:r>
+              <w:t>Regressão fiscal final aprovada. Corrigido alinhamento Hibernate/PostgreSQL do catálogo IBS/CBS e atualizadas fixtures do NfceSchemaValidator.</w:t>
             </w:r>
           </w:p>
         </w:tc>
@@ -4660,14 +5007,7 @@
             <w:vAlign w:val="center"/>
           </w:tcPr>
           <w:p>
-            <w:pPr>
-              <w:spacing w:after="0"/>
-            </w:pPr>
             <w:r>
-              <w:rPr>
-                <w:rFonts w:ascii="Aptos" w:hAnsi="Aptos"/>
-                <w:sz w:val="18"/>
-              </w:rPr>
               <w:t>PENDENTE</w:t>
             </w:r>
           </w:p>
@@ -4684,15 +5024,8 @@
             <w:vAlign w:val="center"/>
           </w:tcPr>
           <w:p>
-            <w:pPr>
-              <w:spacing w:after="0"/>
-            </w:pPr>
             <w:r>
-              <w:rPr>
-                <w:rFonts w:ascii="Aptos" w:hAnsi="Aptos"/>
-                <w:sz w:val="18"/>
-              </w:rPr>
-              <w:t>Repetir com os produtos/regimes/tributações que serão usados em produção.</w:t>
+              <w:t>Depende dos cenários reais do cliente, CNPJ/IE/credenciamento, certificado A1 e homologação externa na SEF/MG.</w:t>
             </w:r>
           </w:p>
         </w:tc>
@@ -4761,14 +5094,7 @@
             <w:vAlign w:val="center"/>
           </w:tcPr>
           <w:p>
-            <w:pPr>
-              <w:spacing w:after="0"/>
-            </w:pPr>
             <w:r>
-              <w:rPr>
-                <w:rFonts w:ascii="Aptos" w:hAnsi="Aptos"/>
-                <w:sz w:val="18"/>
-              </w:rPr>
               <w:t>PENDENTE</w:t>
             </w:r>
           </w:p>
@@ -4786,15 +5112,8 @@
             <w:vAlign w:val="center"/>
           </w:tcPr>
           <w:p>
-            <w:pPr>
-              <w:spacing w:after="0"/>
-            </w:pPr>
             <w:r>
-              <w:rPr>
-                <w:rFonts w:ascii="Aptos" w:hAnsi="Aptos"/>
-                <w:sz w:val="18"/>
-              </w:rPr>
-              <w:t>Guardar XML, protocolos, logs essenciais, prints e identificação da versão.</w:t>
+              <w:t>Arquivar evidências reais após homologação externa.</w:t>
             </w:r>
           </w:p>
         </w:tc>
@@ -4860,14 +5179,7 @@
             <w:vAlign w:val="center"/>
           </w:tcPr>
           <w:p>
-            <w:pPr>
-              <w:spacing w:after="0"/>
-            </w:pPr>
             <w:r>
-              <w:rPr>
-                <w:rFonts w:ascii="Aptos" w:hAnsi="Aptos"/>
-                <w:sz w:val="18"/>
-              </w:rPr>
               <w:t>PENDENTE</w:t>
             </w:r>
           </w:p>
@@ -4884,15 +5196,8 @@
             <w:vAlign w:val="center"/>
           </w:tcPr>
           <w:p>
-            <w:pPr>
-              <w:spacing w:after="0"/>
-            </w:pPr>
             <w:r>
-              <w:rPr>
-                <w:rFonts w:ascii="Aptos" w:hAnsi="Aptos"/>
-                <w:sz w:val="18"/>
-              </w:rPr>
-              <w:t>Somente após todos os itens críticos anteriores.</w:t>
+              <w:t>Somente após homologação externa, evidências reais e revisão das mudanças fiscais que estiverem efetivamente implantadas/aplicáveis.</w:t>
             </w:r>
           </w:p>
         </w:tc>
@@ -4961,14 +5266,7 @@
             <w:vAlign w:val="center"/>
           </w:tcPr>
           <w:p>
-            <w:pPr>
-              <w:spacing w:after="0"/>
-            </w:pPr>
             <w:r>
-              <w:rPr>
-                <w:rFonts w:ascii="Aptos" w:hAnsi="Aptos"/>
-                <w:sz w:val="18"/>
-              </w:rPr>
               <w:t>PENDENTE</w:t>
             </w:r>
           </w:p>
@@ -4986,20 +5284,26 @@
             <w:vAlign w:val="center"/>
           </w:tcPr>
           <w:p>
-            <w:pPr>
-              <w:spacing w:after="0"/>
-            </w:pPr>
             <w:r>
-              <w:rPr>
-                <w:rFonts w:ascii="Aptos" w:hAnsi="Aptos"/>
-                <w:sz w:val="18"/>
-              </w:rPr>
-              <w:t>Ativar somente quando o processo estiver formalmente homologado.</w:t>
+              <w:t>Produção bloqueada até GO formal.</w:t>
             </w:r>
           </w:p>
         </w:tc>
       </w:tr>
     </w:tbl>
+    <w:p>
+      <w:pPr>
+        <w:pStyle w:val="Heading2"/>
+      </w:pPr>
+      <w:r>
+        <w:t>6.1. Estado técnico consolidado em 08/10/2026</w:t>
+      </w:r>
+    </w:p>
+    <w:p>
+      <w:r>
+        <w:t>As etapas marcadas como CONCLUÍDO ou CONCLUÍDO LOCALMENTE comprovam o comportamento técnico coberto por testes automatizados, mas não substituem a homologação fiscal real. A revisão local da Etapa 24 (RTC/NTs 2026) foi concluída no limite atualmente aplicável ao SystemPro. As etapas 12 e 13 permanecem bloqueadas até existirem CNPJ/IE/credenciamento e certificado A1 reais. A produção continua bloqueada até a homologação externa e deve haver nova revisão quando o pacote XSD compatível com as alterações futuras da NT 2026.008 estiver disponível/aplicável.</w:t>
+      </w:r>
+    </w:p>
     <w:p>
       <w:pPr>
         <w:pStyle w:val="Heading1"/>
@@ -5635,29 +5939,10 @@
             </w:tcMar>
           </w:tcPr>
           <w:p>
-            <w:pPr>
-              <w:spacing w:after="40"/>
-            </w:pPr>
             <w:r>
-              <w:rPr>
-                <w:rFonts w:ascii="Aptos" w:hAnsi="Aptos"/>
-                <w:b/>
-                <w:color w:val="1F4E79"/>
-                <w:sz w:val="22"/>
-              </w:rPr>
-              <w:t>Atualização de 2026</w:t>
-            </w:r>
-          </w:p>
-          <w:p>
-            <w:pPr>
-              <w:spacing w:after="0"/>
-            </w:pPr>
-            <w:r>
-              <w:rPr>
-                <w:rFonts w:ascii="Aptos" w:hAnsi="Aptos"/>
-                <w:sz w:val="20"/>
-              </w:rPr>
-              <w:t>A página oficial da SEF/MG informa que NT 2025.002 v1.52, NT 2026.007 v1.10 e NT 2026.008 v1.00, previstas para implantação em homologação em 05/10/2026, foram postergadas para 26/10/2026 em homologação e 16/11/2026 em produção. Portanto, a homologação do SystemPro deve ser revisitada nessas datas antes da liberação definitiva.</w:t>
+              <w:t>Atualização de 08/10/2026</w:t>
+              <w:br/>
+              <w:t>A revisão técnica local da RTC foi concluída com a suíte fiscal completa aprovada. A implantação informada para NT 2025.002 v1.52, NT 2026.007 v1.10 e NT 2026.008 v1.00 permanece prevista para 26/10/2026 em homologação e 16/11/2026 em produção. O SystemPro deve ser revisitado quando o pacote XSD compatível com as alterações futuras da NT 2026.008 estiver disponível/aplicável e, obrigatoriamente, antes do GO produtivo. Esta conclusão local não substitui testes reais com CNPJ/IE/credenciamento e certificado A1.</w:t>
             </w:r>
           </w:p>
         </w:tc>
@@ -5674,14 +5959,13 @@
           <w:color w:val="1F4E79"/>
           <w:sz w:val="21"/>
         </w:rPr>
-        <w:t xml:space="preserve">Reforma Tributária do Consumo (RTC): </w:t>
+        <w:t>Reforma Tributária do Consumo (RTC): a revisão local do SystemPro cobriu CRT/regime, modelo de cálculo IBS/CBS, catálogo dinâmico cClassTrib, snapshot fiscal, serialização IBSCBS/IBSCBSTot e validação integral contra o PL_010f. A NT 2026.010 foi classificada como não aplicável ao DANFE NFC-e modelo 65. Para a NT 2026.008, permanecem sob monitoramento os campos/regras futuros que dependem de pacote XSD compatível e de sua implantação oficial.</w:t>
       </w:r>
       <w:r>
         <w:rPr>
           <w:rFonts w:ascii="Aptos" w:hAnsi="Aptos"/>
           <w:sz w:val="21"/>
         </w:rPr>
-        <w:t>a NT 2025.002 vigente em 01/10/2026 trata da adequação dos leiautes da NF-e/NFC-e para IBS, CBS e IS. Isso deve ser considerado um item obrigatório de revisão do emissor, não apenas do formulário de configuração.</w:t>
       </w:r>
     </w:p>
     <w:p>

</xml_diff>

<commit_message>
feat: adicionar testes para a matriz de estados fiscais de vendas
</commit_message>
<xml_diff>
--- a/docs/SystemPro_NFCe_Documentacao_e_Checklist_Homologacao.docx
+++ b/docs/SystemPro_NFCe_Documentacao_e_Checklist_Homologacao.docx
@@ -317,6 +317,72 @@
                 <w:sz w:val="18"/>
               </w:rPr>
               <w:t>Precisa de revisão antes da liberação, mesmo que exista implementação.</w:t>
+            </w:r>
+          </w:p>
+        </w:tc>
+      </w:tr>
+      <w:tr>
+        <w:tc>
+          <w:tcPr>
+            <w:tcW w:type="dxa" w:w="5184"/>
+          </w:tcPr>
+          <w:p>
+            <w:r>
+              <w:t>CONCLUÍDO LOCALMENTE</w:t>
+            </w:r>
+          </w:p>
+        </w:tc>
+        <w:tc>
+          <w:tcPr>
+            <w:tcW w:type="dxa" w:w="5184"/>
+          </w:tcPr>
+          <w:p>
+            <w:r>
+              <w:t>Implementação e regressão técnica aprovadas localmente; ainda não substitui prova fiscal real na SEF/MG.</w:t>
+            </w:r>
+          </w:p>
+        </w:tc>
+      </w:tr>
+      <w:tr>
+        <w:tc>
+          <w:tcPr>
+            <w:tcW w:type="dxa" w:w="5184"/>
+          </w:tcPr>
+          <w:p>
+            <w:r>
+              <w:t>BLOQUEADO</w:t>
+            </w:r>
+          </w:p>
+        </w:tc>
+        <w:tc>
+          <w:tcPr>
+            <w:tcW w:type="dxa" w:w="5184"/>
+          </w:tcPr>
+          <w:p>
+            <w:r>
+              <w:t>Depende de requisito externo ainda indisponível, como CNPJ/IE/credenciamento/certificado A1 real.</w:t>
+            </w:r>
+          </w:p>
+        </w:tc>
+      </w:tr>
+      <w:tr>
+        <w:tc>
+          <w:tcPr>
+            <w:tcW w:type="dxa" w:w="5184"/>
+          </w:tcPr>
+          <w:p>
+            <w:r>
+              <w:t>N/A</w:t>
+            </w:r>
+          </w:p>
+        </w:tc>
+        <w:tc>
+          <w:tcPr>
+            <w:tcW w:type="dxa" w:w="5184"/>
+          </w:tcPr>
+          <w:p>
+            <w:r>
+              <w:t>Item não aplicável ao fluxo fiscal adotado ou ao modelo NFC-e 65.</w:t>
             </w:r>
           </w:p>
         </w:tc>
@@ -1203,6 +1269,134 @@
                 <w:sz w:val="18"/>
               </w:rPr>
               <w:t>Os erros de TypeScript reportados durante o build foram corrigidos e o build voltou a avançar.</w:t>
+            </w:r>
+          </w:p>
+        </w:tc>
+      </w:tr>
+      <w:tr>
+        <w:tc>
+          <w:tcPr>
+            <w:tcW w:type="dxa" w:w="3456"/>
+          </w:tcPr>
+          <w:p>
+            <w:r>
+              <w:t>Persistência da venda desacoplada da emissão fiscal</w:t>
+            </w:r>
+          </w:p>
+        </w:tc>
+        <w:tc>
+          <w:tcPr>
+            <w:tcW w:type="dxa" w:w="3456"/>
+          </w:tcPr>
+          <w:p>
+            <w:r>
+              <w:t>CONCLUÍDO</w:t>
+            </w:r>
+          </w:p>
+        </w:tc>
+        <w:tc>
+          <w:tcPr>
+            <w:tcW w:type="dxa" w:w="3456"/>
+          </w:tcPr>
+          <w:p>
+            <w:r>
+              <w:t>A venda é persistida antes da tentativa fiscal; a NFC-e permanece em AGUARDANDO_AUTORIZACAO quando a emissão não pode prosseguir, inclusive sem A1 real.</w:t>
+            </w:r>
+          </w:p>
+        </w:tc>
+      </w:tr>
+      <w:tr>
+        <w:tc>
+          <w:tcPr>
+            <w:tcW w:type="dxa" w:w="3456"/>
+          </w:tcPr>
+          <w:p>
+            <w:r>
+              <w:t>Contingência offline NFC-e</w:t>
+            </w:r>
+          </w:p>
+        </w:tc>
+        <w:tc>
+          <w:tcPr>
+            <w:tcW w:type="dxa" w:w="3456"/>
+          </w:tcPr>
+          <w:p>
+            <w:r>
+              <w:t>CONCLUÍDO LOCALMENTE</w:t>
+            </w:r>
+          </w:p>
+        </w:tc>
+        <w:tc>
+          <w:tcPr>
+            <w:tcW w:type="dxa" w:w="3456"/>
+          </w:tcPr>
+          <w:p>
+            <w:r>
+              <w:t>Fluxo tpEmis=9 implementado com dhCont/xJust, chave própria, QR Code v3 offline assinado, DANFE de contingência e transmissão posterior do mesmo XML/chave persistidos.</w:t>
+            </w:r>
+          </w:p>
+        </w:tc>
+      </w:tr>
+      <w:tr>
+        <w:tc>
+          <w:tcPr>
+            <w:tcW w:type="dxa" w:w="3456"/>
+          </w:tcPr>
+          <w:p>
+            <w:r>
+              <w:t>Fila operacional de pendências fiscais</w:t>
+            </w:r>
+          </w:p>
+        </w:tc>
+        <w:tc>
+          <w:tcPr>
+            <w:tcW w:type="dxa" w:w="3456"/>
+          </w:tcPr>
+          <w:p>
+            <w:r>
+              <w:t>CONCLUÍDO</w:t>
+            </w:r>
+          </w:p>
+        </w:tc>
+        <w:tc>
+          <w:tcPr>
+            <w:tcW w:type="dxa" w:w="3456"/>
+          </w:tcPr>
+          <w:p>
+            <w:r>
+              <w:t>PDV possui consulta persistente e paginada das pendências fiscais, sem depender apenas da lista de vendas recentes.</w:t>
+            </w:r>
+          </w:p>
+        </w:tc>
+      </w:tr>
+      <w:tr>
+        <w:tc>
+          <w:tcPr>
+            <w:tcW w:type="dxa" w:w="3456"/>
+          </w:tcPr>
+          <w:p>
+            <w:r>
+              <w:t>Recuperação e máquina de estados fiscal</w:t>
+            </w:r>
+          </w:p>
+        </w:tc>
+        <w:tc>
+          <w:tcPr>
+            <w:tcW w:type="dxa" w:w="3456"/>
+          </w:tcPr>
+          <w:p>
+            <w:r>
+              <w:t>CONCLUÍDO</w:t>
+            </w:r>
+          </w:p>
+        </w:tc>
+        <w:tc>
+          <w:tcPr>
+            <w:tcW w:type="dxa" w:w="3456"/>
+          </w:tcPr>
+          <w:p>
+            <w:r>
+              <w:t>PENDENTE_CONSULTA e CANCELAMENTO_PENDENTE possuem recuperações distintas; backend impõe invariantes de estado e regressão matricial backend/frontend foi aprovada.</w:t>
             </w:r>
           </w:p>
         </w:tc>
@@ -4983,15 +5177,8 @@
             <w:vAlign w:val="center"/>
           </w:tcPr>
           <w:p>
-            <w:pPr>
-              <w:spacing w:after="0"/>
-            </w:pPr>
             <w:r>
-              <w:rPr>
-                <w:rFonts w:ascii="Aptos" w:hAnsi="Aptos"/>
-                <w:sz w:val="18"/>
-              </w:rPr>
-              <w:t>Teste com os cenários reais do cliente</w:t>
+              <w:t>Alinhamento do perfil fiscal do produto no frontend</w:t>
             </w:r>
           </w:p>
         </w:tc>
@@ -5008,7 +5195,7 @@
           </w:tcPr>
           <w:p>
             <w:r>
-              <w:t>PENDENTE</w:t>
+              <w:t>CONCLUÍDO</w:t>
             </w:r>
           </w:p>
         </w:tc>
@@ -5025,7 +5212,7 @@
           </w:tcPr>
           <w:p>
             <w:r>
-              <w:t>Depende dos cenários reais do cliente, CNPJ/IE/credenciamento, certificado A1 e homologação externa na SEF/MG.</w:t>
+              <w:t>Frontend alinhado ao perfil fiscal utilizado pelo backend, preservando as validações fiscais já consolidadas.</w:t>
             </w:r>
           </w:p>
         </w:tc>
@@ -5069,15 +5256,8 @@
             <w:vAlign w:val="center"/>
           </w:tcPr>
           <w:p>
-            <w:pPr>
-              <w:spacing w:after="0"/>
-            </w:pPr>
             <w:r>
-              <w:rPr>
-                <w:rFonts w:ascii="Aptos" w:hAnsi="Aptos"/>
-                <w:sz w:val="18"/>
-              </w:rPr>
-              <w:t>Evidências arquivadas</w:t>
+              <w:t>Ajustes operacionais da tela de vendas/PDV</w:t>
             </w:r>
           </w:p>
         </w:tc>
@@ -5095,7 +5275,7 @@
           </w:tcPr>
           <w:p>
             <w:r>
-              <w:t>PENDENTE</w:t>
+              <w:t>CONCLUÍDO</w:t>
             </w:r>
           </w:p>
         </w:tc>
@@ -5113,7 +5293,7 @@
           </w:tcPr>
           <w:p>
             <w:r>
-              <w:t>Arquivar evidências reais após homologação externa.</w:t>
+              <w:t>Fluxo de venda revisado para quantidade, valores, loading e comportamento operacional antes da emissão fiscal.</w:t>
             </w:r>
           </w:p>
         </w:tc>
@@ -5155,15 +5335,8 @@
             <w:vAlign w:val="center"/>
           </w:tcPr>
           <w:p>
-            <w:pPr>
-              <w:spacing w:after="0"/>
-            </w:pPr>
             <w:r>
-              <w:rPr>
-                <w:rFonts w:ascii="Aptos" w:hAnsi="Aptos"/>
-                <w:sz w:val="18"/>
-              </w:rPr>
-              <w:t>Aprovação final para produção</w:t>
+              <w:t>Persistência da venda desacoplada da emissão NFC-e</w:t>
             </w:r>
           </w:p>
         </w:tc>
@@ -5180,7 +5353,7 @@
           </w:tcPr>
           <w:p>
             <w:r>
-              <w:t>PENDENTE</w:t>
+              <w:t>CONCLUÍDO</w:t>
             </w:r>
           </w:p>
         </w:tc>
@@ -5197,7 +5370,7 @@
           </w:tcPr>
           <w:p>
             <w:r>
-              <w:t>Somente após homologação externa, evidências reais e revisão das mudanças fiscais que estiverem efetivamente implantadas/aplicáveis.</w:t>
+              <w:t>POST /sales persiste venda e documento fiscal em AGUARDANDO_AUTORIZACAO; POST /sales/{id}/issue executa a emissão separadamente. Venda permanece registrada quando A1 não está disponível.</w:t>
             </w:r>
           </w:p>
         </w:tc>
@@ -5241,15 +5414,8 @@
             <w:vAlign w:val="center"/>
           </w:tcPr>
           <w:p>
-            <w:pPr>
-              <w:spacing w:after="0"/>
-            </w:pPr>
             <w:r>
-              <w:rPr>
-                <w:rFonts w:ascii="Aptos" w:hAnsi="Aptos"/>
-                <w:sz w:val="18"/>
-              </w:rPr>
-              <w:t>Habilitação de produção</w:t>
+              <w:t>Contingência offline segura</w:t>
             </w:r>
           </w:p>
         </w:tc>
@@ -5267,7 +5433,7 @@
           </w:tcPr>
           <w:p>
             <w:r>
-              <w:t>PENDENTE</w:t>
+              <w:t>CONCLUÍDO LOCALMENTE</w:t>
             </w:r>
           </w:p>
         </w:tc>
@@ -5285,7 +5451,343 @@
           </w:tcPr>
           <w:p>
             <w:r>
-              <w:t>Produção bloqueada até GO formal.</w:t>
+              <w:t>Contingência explícita implementada: tpEmis=9, dhCont/xJust, QR Code v3 offline, DANFE, persistência e transmissão posterior do mesmo XML/chave. Resultado incerto pós-transmissão continua em PENDENTE_CONSULTA, sem retransmissão cega.</w:t>
+            </w:r>
+          </w:p>
+        </w:tc>
+      </w:tr>
+      <w:tr>
+        <w:tc>
+          <w:tcPr>
+            <w:tcW w:type="dxa" w:w="2592"/>
+          </w:tcPr>
+          <w:p>
+            <w:r>
+              <w:t>29</w:t>
+            </w:r>
+          </w:p>
+        </w:tc>
+        <w:tc>
+          <w:tcPr>
+            <w:tcW w:type="dxa" w:w="2592"/>
+          </w:tcPr>
+          <w:p>
+            <w:r>
+              <w:t>Operação de contingência no frontend/PDV</w:t>
+            </w:r>
+          </w:p>
+        </w:tc>
+        <w:tc>
+          <w:tcPr>
+            <w:tcW w:type="dxa" w:w="2592"/>
+          </w:tcPr>
+          <w:p>
+            <w:r>
+              <w:t>CONCLUÍDO</w:t>
+            </w:r>
+          </w:p>
+        </w:tc>
+        <w:tc>
+          <w:tcPr>
+            <w:tcW w:type="dxa" w:w="2592"/>
+          </w:tcPr>
+          <w:p>
+            <w:r>
+              <w:t>Ações fiscais centralizadas no frontend; contingência é explícita e nunca acionada automaticamente como fallback. Regressão frontend aprovada.</w:t>
+            </w:r>
+          </w:p>
+        </w:tc>
+      </w:tr>
+      <w:tr>
+        <w:tc>
+          <w:tcPr>
+            <w:tcW w:type="dxa" w:w="2592"/>
+          </w:tcPr>
+          <w:p>
+            <w:r>
+              <w:t>30</w:t>
+            </w:r>
+          </w:p>
+        </w:tc>
+        <w:tc>
+          <w:tcPr>
+            <w:tcW w:type="dxa" w:w="2592"/>
+          </w:tcPr>
+          <w:p>
+            <w:r>
+              <w:t>Fila persistente de pendências fiscais</w:t>
+            </w:r>
+          </w:p>
+        </w:tc>
+        <w:tc>
+          <w:tcPr>
+            <w:tcW w:type="dxa" w:w="2592"/>
+          </w:tcPr>
+          <w:p>
+            <w:r>
+              <w:t>CONCLUÍDO</w:t>
+            </w:r>
+          </w:p>
+        </w:tc>
+        <w:tc>
+          <w:tcPr>
+            <w:tcW w:type="dxa" w:w="2592"/>
+          </w:tcPr>
+          <w:p>
+            <w:r>
+              <w:t>Endpoint paginado consulta no banco AGUARDANDO_AUTORIZACAO, PENDENTE_CONSULTA, CONTINGENCIA e CANCELAMENTO_PENDENTE; PDV exibe a fila independentemente das vendas recentes.</w:t>
+            </w:r>
+          </w:p>
+        </w:tc>
+      </w:tr>
+      <w:tr>
+        <w:tc>
+          <w:tcPr>
+            <w:tcW w:type="dxa" w:w="2592"/>
+          </w:tcPr>
+          <w:p>
+            <w:r>
+              <w:t>31</w:t>
+            </w:r>
+          </w:p>
+        </w:tc>
+        <w:tc>
+          <w:tcPr>
+            <w:tcW w:type="dxa" w:w="2592"/>
+          </w:tcPr>
+          <w:p>
+            <w:r>
+              <w:t>Recuperação de CANCELAMENTO_PENDENTE</w:t>
+            </w:r>
+          </w:p>
+        </w:tc>
+        <w:tc>
+          <w:tcPr>
+            <w:tcW w:type="dxa" w:w="2592"/>
+          </w:tcPr>
+          <w:p>
+            <w:r>
+              <w:t>CONCLUÍDO LOCALMENTE</w:t>
+            </w:r>
+          </w:p>
+        </w:tc>
+        <w:tc>
+          <w:tcPr>
+            <w:tcW w:type="dxa" w:w="2592"/>
+          </w:tcPr>
+          <w:p>
+            <w:r>
+              <w:t>Consulta dedicada de cancelamento implementada sem retransmitir cegamente o evento. Frontend usa ação específica "Consultar cancelamento". Testes backend/frontend aprovados.</w:t>
+            </w:r>
+          </w:p>
+        </w:tc>
+      </w:tr>
+      <w:tr>
+        <w:tc>
+          <w:tcPr>
+            <w:tcW w:type="dxa" w:w="2592"/>
+          </w:tcPr>
+          <w:p>
+            <w:r>
+              <w:t>32</w:t>
+            </w:r>
+          </w:p>
+        </w:tc>
+        <w:tc>
+          <w:tcPr>
+            <w:tcW w:type="dxa" w:w="2592"/>
+          </w:tcPr>
+          <w:p>
+            <w:r>
+              <w:t>Auditoria e regressão da máquina de estados fiscal</w:t>
+            </w:r>
+          </w:p>
+        </w:tc>
+        <w:tc>
+          <w:tcPr>
+            <w:tcW w:type="dxa" w:w="2592"/>
+          </w:tcPr>
+          <w:p>
+            <w:r>
+              <w:t>CONCLUÍDO</w:t>
+            </w:r>
+          </w:p>
+        </w:tc>
+        <w:tc>
+          <w:tcPr>
+            <w:tcW w:type="dxa" w:w="2592"/>
+          </w:tcPr>
+          <w:p>
+            <w:r>
+              <w:t>Backend passou a impor as mesmas invariantes do frontend. Emissão/consulta inválidas são bloqueadas antes do gateway SEFAZ; regressão matricial backend/frontend e builds foram aprovados.</w:t>
+            </w:r>
+          </w:p>
+        </w:tc>
+      </w:tr>
+      <w:tr>
+        <w:tc>
+          <w:tcPr>
+            <w:tcW w:type="dxa" w:w="2592"/>
+          </w:tcPr>
+          <w:p>
+            <w:r>
+              <w:t>33</w:t>
+            </w:r>
+          </w:p>
+        </w:tc>
+        <w:tc>
+          <w:tcPr>
+            <w:tcW w:type="dxa" w:w="2592"/>
+          </w:tcPr>
+          <w:p>
+            <w:r>
+              <w:t>Teste com os cenários reais do cliente</w:t>
+            </w:r>
+          </w:p>
+        </w:tc>
+        <w:tc>
+          <w:tcPr>
+            <w:tcW w:type="dxa" w:w="2592"/>
+          </w:tcPr>
+          <w:p>
+            <w:r>
+              <w:t>PENDENTE</w:t>
+            </w:r>
+          </w:p>
+        </w:tc>
+        <w:tc>
+          <w:tcPr>
+            <w:tcW w:type="dxa" w:w="2592"/>
+          </w:tcPr>
+          <w:p>
+            <w:r>
+              <w:t>Depende dos cenários reais do cliente, CNPJ/IE/credenciamento, certificado A1 e homologação externa na SEF/MG.</w:t>
+            </w:r>
+          </w:p>
+        </w:tc>
+      </w:tr>
+      <w:tr>
+        <w:tc>
+          <w:tcPr>
+            <w:tcW w:type="dxa" w:w="2592"/>
+          </w:tcPr>
+          <w:p>
+            <w:r>
+              <w:t>34</w:t>
+            </w:r>
+          </w:p>
+        </w:tc>
+        <w:tc>
+          <w:tcPr>
+            <w:tcW w:type="dxa" w:w="2592"/>
+          </w:tcPr>
+          <w:p>
+            <w:r>
+              <w:t>Evidências reais de homologação arquivadas</w:t>
+            </w:r>
+          </w:p>
+        </w:tc>
+        <w:tc>
+          <w:tcPr>
+            <w:tcW w:type="dxa" w:w="2592"/>
+          </w:tcPr>
+          <w:p>
+            <w:r>
+              <w:t>PENDENTE</w:t>
+            </w:r>
+          </w:p>
+        </w:tc>
+        <w:tc>
+          <w:tcPr>
+            <w:tcW w:type="dxa" w:w="2592"/>
+          </w:tcPr>
+          <w:p>
+            <w:r>
+              <w:t>Arquivar evidências reais após homologação externa: status, autorização, consulta, cancelamento, DANFE/QR Code e logs de auditoria sem segredos.</w:t>
+            </w:r>
+          </w:p>
+        </w:tc>
+      </w:tr>
+      <w:tr>
+        <w:tc>
+          <w:tcPr>
+            <w:tcW w:type="dxa" w:w="2592"/>
+          </w:tcPr>
+          <w:p>
+            <w:r>
+              <w:t>35</w:t>
+            </w:r>
+          </w:p>
+        </w:tc>
+        <w:tc>
+          <w:tcPr>
+            <w:tcW w:type="dxa" w:w="2592"/>
+          </w:tcPr>
+          <w:p>
+            <w:r>
+              <w:t>Aprovação final para produção</w:t>
+            </w:r>
+          </w:p>
+        </w:tc>
+        <w:tc>
+          <w:tcPr>
+            <w:tcW w:type="dxa" w:w="2592"/>
+          </w:tcPr>
+          <w:p>
+            <w:r>
+              <w:t>PENDENTE</w:t>
+            </w:r>
+          </w:p>
+        </w:tc>
+        <w:tc>
+          <w:tcPr>
+            <w:tcW w:type="dxa" w:w="2592"/>
+          </w:tcPr>
+          <w:p>
+            <w:r>
+              <w:t>Somente após homologação externa, evidências reais e revisão das mudanças fiscais efetivamente implantadas/aplicáveis.</w:t>
+            </w:r>
+          </w:p>
+        </w:tc>
+      </w:tr>
+      <w:tr>
+        <w:tc>
+          <w:tcPr>
+            <w:tcW w:type="dxa" w:w="2592"/>
+          </w:tcPr>
+          <w:p>
+            <w:r>
+              <w:t>36</w:t>
+            </w:r>
+          </w:p>
+        </w:tc>
+        <w:tc>
+          <w:tcPr>
+            <w:tcW w:type="dxa" w:w="2592"/>
+          </w:tcPr>
+          <w:p>
+            <w:r>
+              <w:t>Habilitação de produção</w:t>
+            </w:r>
+          </w:p>
+        </w:tc>
+        <w:tc>
+          <w:tcPr>
+            <w:tcW w:type="dxa" w:w="2592"/>
+          </w:tcPr>
+          <w:p>
+            <w:r>
+              <w:t>PENDENTE</w:t>
+            </w:r>
+          </w:p>
+        </w:tc>
+        <w:tc>
+          <w:tcPr>
+            <w:tcW w:type="dxa" w:w="2592"/>
+          </w:tcPr>
+          <w:p>
+            <w:r>
+              <w:t>Produção permanece bloqueada até GO formal.</w:t>
             </w:r>
           </w:p>
         </w:tc>
@@ -5301,7 +5803,13 @@
     </w:p>
     <w:p>
       <w:r>
-        <w:t>As etapas marcadas como CONCLUÍDO ou CONCLUÍDO LOCALMENTE comprovam o comportamento técnico coberto por testes automatizados, mas não substituem a homologação fiscal real. A revisão local da Etapa 24 (RTC/NTs 2026) foi concluída no limite atualmente aplicável ao SystemPro. As etapas 12 e 13 permanecem bloqueadas até existirem CNPJ/IE/credenciamento e certificado A1 reais. A produção continua bloqueada até a homologação externa e deve haver nova revisão quando o pacote XSD compatível com as alterações futuras da NT 2026.008 estiver disponível/aplicável.</w:t>
+        <w:t>As etapas marcadas como CONCLUÍDO ou CONCLUÍDO LOCALMENTE comprovam o comportamento técnico coberto por testes automatizados, mas não substituem a homologação fiscal real. A revisão local da Etapa 24 (RTC/NTs 2026) foi concluída no limite atualmente aplicável ao SystemPro. As Etapas 25 a 32 também foram concluídas tecnicamente: alinhamento fiscal do produto/PDV, desacoplamento entre venda e emissão, contingência offline segura, fila persistente de pendências, recuperação de cancelamento pendente e endurecimento/regressão da máquina de estados fiscal. As Etapas 12 e 13 continuam bloqueadas até existirem CNPJ/IE/credenciamento e certificado A1 reais. As Etapas 33 a 36 concentram a homologação externa, evidências e GO produtivo. A produção continua bloqueada até essa validação e deve haver nova revisão quando o pacote XSD compatível com as alterações futuras da NT 2026.008 estiver disponível/aplicável.</w:t>
+      </w:r>
+    </w:p>
+    <w:p>
+      <w:pPr/>
+      <w:r>
+        <w:t>Marco técnico após a Etapa 32: a máquina de estados fiscal está protegida em duas camadas. O frontend só oferece ações compatíveis com o estado atual, enquanto o backend valida as invariantes antes de alcançar o gateway SEFAZ. PENDENTE_CONSULTA, CONTINGENCIA e CANCELAMENTO_PENDENTE possuem caminhos operacionais distintos, evitando retransmissões indevidas. Este marco é técnico/local e não altera o NO-GO de produção sem homologação real.</w:t>
       </w:r>
     </w:p>
     <w:p>
@@ -6288,7 +6796,7 @@
         <w:color w:val="6B7280"/>
         <w:sz w:val="16"/>
       </w:rPr>
-      <w:t>Uso interno de desenvolvimento e homologação | Data: 07/10/2026</w:t>
+      <w:t>Uso interno de desenvolvimento e homologação | Data: 08/10/2026</w:t>
     </w:r>
   </w:p>
 </w:ftr>

</xml_diff>